<commit_message>
chore(scopes): archive remind scope, add bot-shared-awareness RFC
- Moved remind-skill-implementation.md to scopes/archive/
- Added scopes/bot-shared-awareness/ RFC (proposed shared system log)
- Updated crawler-bot-v2.docx

Co-Authored-By: Claude Sonnet 4.6 <noreply@anthropic.com>
</commit_message>
<xml_diff>
--- a/scopes/crawler-bot-v2.docx
+++ b/scopes/crawler-bot-v2.docx
@@ -2,7 +2,7 @@
 <file path=word/document.xml><?xml version="1.0" encoding="utf-8"?>
 <w:document xmlns:w="http://schemas.openxmlformats.org/wordprocessingml/2006/main" xmlns:m="http://schemas.openxmlformats.org/officeDocument/2006/math" xmlns:r="http://schemas.openxmlformats.org/officeDocument/2006/relationships" xmlns:o="urn:schemas-microsoft-com:office:office" xmlns:v="urn:schemas-microsoft-com:vml" xmlns:w10="urn:schemas-microsoft-com:office:word" xmlns:a="http://schemas.openxmlformats.org/drawingml/2006/main" xmlns:pic="http://schemas.openxmlformats.org/drawingml/2006/picture" xmlns:wp="http://schemas.openxmlformats.org/drawingml/2006/wordprocessingDrawing">
   <w:body>
-    <w:bookmarkStart w:id="31" w:name="crawler-bot-v2-scope"/>
+    <w:bookmarkStart w:id="32" w:name="crawler-bot-v2-scope"/>
     <w:p>
       <w:pPr>
         <w:pStyle w:val="Heading1"/>
@@ -1986,7 +1986,341 @@
       </w:r>
     </w:p>
     <w:bookmarkEnd w:id="22"/>
-    <w:bookmarkStart w:id="23" w:name="security-safety"/>
+    <w:bookmarkStart w:id="23" w:name="one-row-per-person"/>
+    <w:p>
+      <w:pPr>
+        <w:pStyle w:val="Heading2"/>
+      </w:pPr>
+      <w:r>
+        <w:t xml:space="preserve">One Row Per Person</w:t>
+      </w:r>
+    </w:p>
+    <w:p>
+      <w:pPr>
+        <w:pStyle w:val="FirstParagraph"/>
+      </w:pPr>
+      <w:r>
+        <w:t xml:space="preserve">When a page lists multiple people (e.g. motywdesign.pl has Józef Bis and Paweł Deroń), the bot creates</w:t>
+      </w:r>
+      <w:r>
+        <w:t xml:space="preserve"> </w:t>
+      </w:r>
+      <w:r>
+        <w:rPr>
+          <w:b/>
+          <w:bCs/>
+        </w:rPr>
+        <w:t xml:space="preserve">one row per person</w:t>
+      </w:r>
+      <w:r>
+        <w:t xml:space="preserve"> </w:t>
+      </w:r>
+      <w:r>
+        <w:t xml:space="preserve">— not one row per page.</w:t>
+      </w:r>
+    </w:p>
+    <w:p>
+      <w:pPr>
+        <w:pStyle w:val="BodyText"/>
+      </w:pPr>
+      <w:r>
+        <w:t xml:space="preserve">Shared fields (company name, email, website) are duplicated across all rows from the same page.</w:t>
+      </w:r>
+    </w:p>
+    <w:p>
+      <w:pPr>
+        <w:pStyle w:val="BodyText"/>
+      </w:pPr>
+      <w:r>
+        <w:rPr>
+          <w:b/>
+          <w:bCs/>
+        </w:rPr>
+        <w:t xml:space="preserve">Example — motywdesign.pl:</w:t>
+      </w:r>
+    </w:p>
+    <w:tbl>
+      <w:tblPr>
+        <w:tblStyle w:val="Table"/>
+        <w:tblW w:type="pct" w:w="5000"/>
+        <w:tblLayout w:type="fixed"/>
+        <w:tblLook w:firstRow="1" w:lastRow="0" w:firstColumn="0" w:lastColumn="0" w:noHBand="0" w:noVBand="0" w:val="0020"/>
+      </w:tblPr>
+      <w:tblGrid>
+        <w:gridCol w:w="1228"/>
+        <w:gridCol w:w="1638"/>
+        <w:gridCol w:w="955"/>
+        <w:gridCol w:w="955"/>
+        <w:gridCol w:w="1228"/>
+        <w:gridCol w:w="1911"/>
+      </w:tblGrid>
+      <w:tr>
+        <w:trPr>
+          <w:tblHeader w:val="on"/>
+        </w:trPr>
+        <w:tc>
+          <w:tcPr/>
+          <w:p>
+            <w:pPr>
+              <w:pStyle w:val="Compact"/>
+            </w:pPr>
+            <w:r>
+              <w:t xml:space="preserve">Company</w:t>
+            </w:r>
+          </w:p>
+        </w:tc>
+        <w:tc>
+          <w:tcPr/>
+          <w:p>
+            <w:pPr>
+              <w:pStyle w:val="Compact"/>
+            </w:pPr>
+            <w:r>
+              <w:t xml:space="preserve">Person Name</w:t>
+            </w:r>
+          </w:p>
+        </w:tc>
+        <w:tc>
+          <w:tcPr/>
+          <w:p>
+            <w:pPr>
+              <w:pStyle w:val="Compact"/>
+            </w:pPr>
+            <w:r>
+              <w:t xml:space="preserve">Phone</w:t>
+            </w:r>
+          </w:p>
+        </w:tc>
+        <w:tc>
+          <w:tcPr/>
+          <w:p>
+            <w:pPr>
+              <w:pStyle w:val="Compact"/>
+            </w:pPr>
+            <w:r>
+              <w:t xml:space="preserve">Email</w:t>
+            </w:r>
+          </w:p>
+        </w:tc>
+        <w:tc>
+          <w:tcPr/>
+          <w:p>
+            <w:pPr>
+              <w:pStyle w:val="Compact"/>
+            </w:pPr>
+            <w:r>
+              <w:t xml:space="preserve">Website</w:t>
+            </w:r>
+          </w:p>
+        </w:tc>
+        <w:tc>
+          <w:tcPr/>
+          <w:p>
+            <w:pPr>
+              <w:pStyle w:val="Compact"/>
+            </w:pPr>
+            <w:r>
+              <w:t xml:space="preserve">Record Status</w:t>
+            </w:r>
+          </w:p>
+        </w:tc>
+      </w:tr>
+      <w:tr>
+        <w:tc>
+          <w:tcPr/>
+          <w:p>
+            <w:pPr>
+              <w:pStyle w:val="Compact"/>
+            </w:pPr>
+            <w:r>
+              <w:t xml:space="preserve">Motyw Design</w:t>
+            </w:r>
+          </w:p>
+        </w:tc>
+        <w:tc>
+          <w:tcPr/>
+          <w:p>
+            <w:pPr>
+              <w:pStyle w:val="Compact"/>
+            </w:pPr>
+            <w:r>
+              <w:t xml:space="preserve">Józef Bis</w:t>
+            </w:r>
+          </w:p>
+        </w:tc>
+        <w:tc>
+          <w:tcPr/>
+          <w:p>
+            <w:pPr>
+              <w:pStyle w:val="Compact"/>
+            </w:pPr>
+            <w:r>
+              <w:t xml:space="preserve">+48 781 562 256</w:t>
+            </w:r>
+          </w:p>
+        </w:tc>
+        <w:tc>
+          <w:tcPr/>
+          <w:p>
+            <w:pPr>
+              <w:pStyle w:val="Compact"/>
+            </w:pPr>
+            <w:r>
+              <w:t xml:space="preserve">motywdesign@gmail.com</w:t>
+            </w:r>
+          </w:p>
+        </w:tc>
+        <w:tc>
+          <w:tcPr/>
+          <w:p>
+            <w:pPr>
+              <w:pStyle w:val="Compact"/>
+            </w:pPr>
+            <w:r>
+              <w:t xml:space="preserve">motywdesign.pl</w:t>
+            </w:r>
+          </w:p>
+        </w:tc>
+        <w:tc>
+          <w:tcPr/>
+          <w:p>
+            <w:pPr>
+              <w:pStyle w:val="Compact"/>
+            </w:pPr>
+            <w:r>
+              <w:t xml:space="preserve">complete</w:t>
+            </w:r>
+          </w:p>
+        </w:tc>
+      </w:tr>
+      <w:tr>
+        <w:tc>
+          <w:tcPr/>
+          <w:p>
+            <w:pPr>
+              <w:pStyle w:val="Compact"/>
+            </w:pPr>
+            <w:r>
+              <w:t xml:space="preserve">Motyw Design</w:t>
+            </w:r>
+          </w:p>
+        </w:tc>
+        <w:tc>
+          <w:tcPr/>
+          <w:p>
+            <w:pPr>
+              <w:pStyle w:val="Compact"/>
+            </w:pPr>
+            <w:r>
+              <w:t xml:space="preserve">Paweł Deroń</w:t>
+            </w:r>
+          </w:p>
+        </w:tc>
+        <w:tc>
+          <w:tcPr/>
+          <w:p>
+            <w:pPr>
+              <w:pStyle w:val="Compact"/>
+            </w:pPr>
+            <w:r>
+              <w:t xml:space="preserve">+48 792 337 013</w:t>
+            </w:r>
+          </w:p>
+        </w:tc>
+        <w:tc>
+          <w:tcPr/>
+          <w:p>
+            <w:pPr>
+              <w:pStyle w:val="Compact"/>
+            </w:pPr>
+            <w:r>
+              <w:t xml:space="preserve">motywdesign@gmail.com</w:t>
+            </w:r>
+          </w:p>
+        </w:tc>
+        <w:tc>
+          <w:tcPr/>
+          <w:p>
+            <w:pPr>
+              <w:pStyle w:val="Compact"/>
+            </w:pPr>
+            <w:r>
+              <w:t xml:space="preserve">motywdesign.pl</w:t>
+            </w:r>
+          </w:p>
+        </w:tc>
+        <w:tc>
+          <w:tcPr/>
+          <w:p>
+            <w:pPr>
+              <w:pStyle w:val="Compact"/>
+            </w:pPr>
+            <w:r>
+              <w:t xml:space="preserve">complete</w:t>
+            </w:r>
+          </w:p>
+        </w:tc>
+      </w:tr>
+    </w:tbl>
+    <w:p>
+      <w:pPr>
+        <w:pStyle w:val="BodyText"/>
+      </w:pPr>
+      <w:r>
+        <w:t xml:space="preserve">This means:</w:t>
+      </w:r>
+      <w:r>
+        <w:t xml:space="preserve"> </w:t>
+      </w:r>
+      <w:r>
+        <w:t xml:space="preserve">- A page with 1 person → 1 row</w:t>
+      </w:r>
+      <w:r>
+        <w:t xml:space="preserve"> </w:t>
+      </w:r>
+      <w:r>
+        <w:t xml:space="preserve">- A page with 3 people → 3 rows</w:t>
+      </w:r>
+      <w:r>
+        <w:t xml:space="preserve"> </w:t>
+      </w:r>
+      <w:r>
+        <w:t xml:space="preserve">- A catalog page listing 50 companies → potentially 100+ rows if each company has 2 contacts</w:t>
+      </w:r>
+    </w:p>
+    <w:p>
+      <w:pPr>
+        <w:pStyle w:val="BodyText"/>
+      </w:pPr>
+      <w:r>
+        <w:t xml:space="preserve">Ollama is instructed to find</w:t>
+      </w:r>
+      <w:r>
+        <w:t xml:space="preserve"> </w:t>
+      </w:r>
+      <w:r>
+        <w:rPr>
+          <w:b/>
+          <w:bCs/>
+        </w:rPr>
+        <w:t xml:space="preserve">every person mentioned</w:t>
+      </w:r>
+      <w:r>
+        <w:t xml:space="preserve"> </w:t>
+      </w:r>
+      <w:r>
+        <w:t xml:space="preserve">on the page and create a separate record for each, inheriting shared fields like company name and email.</w:t>
+      </w:r>
+    </w:p>
+    <w:p>
+      <w:r>
+        <w:pict>
+          <v:rect style="width:0;height:1.5pt" o:hralign="center" o:hrstd="t" o:hr="t"/>
+        </w:pict>
+      </w:r>
+    </w:p>
+    <w:bookmarkEnd w:id="23"/>
+    <w:bookmarkStart w:id="24" w:name="security-safety"/>
     <w:p>
       <w:pPr>
         <w:pStyle w:val="Heading2"/>
@@ -2401,8 +2735,8 @@
         </w:pict>
       </w:r>
     </w:p>
-    <w:bookmarkEnd w:id="23"/>
-    <w:bookmarkStart w:id="24" w:name="example-session"/>
+    <w:bookmarkEnd w:id="24"/>
+    <w:bookmarkStart w:id="25" w:name="example-session"/>
     <w:p>
       <w:pPr>
         <w:pStyle w:val="Heading2"/>
@@ -2651,8 +2985,8 @@
         </w:pict>
       </w:r>
     </w:p>
-    <w:bookmarkEnd w:id="24"/>
-    <w:bookmarkStart w:id="25" w:name="what-gets-built"/>
+    <w:bookmarkEnd w:id="25"/>
+    <w:bookmarkStart w:id="26" w:name="what-gets-built"/>
     <w:p>
       <w:pPr>
         <w:pStyle w:val="Heading2"/>
@@ -3076,8 +3410,8 @@
         </w:pict>
       </w:r>
     </w:p>
-    <w:bookmarkEnd w:id="25"/>
-    <w:bookmarkStart w:id="30" w:name="excel-output-example-headers"/>
+    <w:bookmarkEnd w:id="26"/>
+    <w:bookmarkStart w:id="31" w:name="excel-output-example-headers"/>
     <w:p>
       <w:pPr>
         <w:pStyle w:val="Heading2"/>
@@ -3094,7 +3428,7 @@
         <w:t xml:space="preserve">The first columns are always fixed system columns. The remaining columns are dynamic — generated from your job description.</w:t>
       </w:r>
     </w:p>
-    <w:bookmarkStart w:id="26" w:name="fixed-columns-always-present"/>
+    <w:bookmarkStart w:id="27" w:name="fixed-columns-always-present"/>
     <w:p>
       <w:pPr>
         <w:pStyle w:val="Heading3"/>
@@ -3458,8 +3792,8 @@
         </w:tc>
       </w:tr>
     </w:tbl>
-    <w:bookmarkEnd w:id="26"/>
-    <w:bookmarkStart w:id="27" w:name="dynamic-columns-contact-job-example"/>
+    <w:bookmarkEnd w:id="27"/>
+    <w:bookmarkStart w:id="28" w:name="dynamic-columns-contact-job-example"/>
     <w:p>
       <w:pPr>
         <w:pStyle w:val="Heading3"/>
@@ -3732,8 +4066,8 @@
         </w:tc>
       </w:tr>
     </w:tbl>
-    <w:bookmarkEnd w:id="27"/>
-    <w:bookmarkStart w:id="28" w:name="X88ac36a0593700c2065e72fcdf6243ee82bf9d9"/>
+    <w:bookmarkEnd w:id="28"/>
+    <w:bookmarkStart w:id="29" w:name="X88ac36a0593700c2065e72fcdf6243ee82bf9d9"/>
     <w:p>
       <w:pPr>
         <w:pStyle w:val="Heading3"/>
@@ -4005,8 +4339,8 @@
         </w:tc>
       </w:tr>
     </w:tbl>
-    <w:bookmarkEnd w:id="28"/>
-    <w:bookmarkStart w:id="29" w:name="notes-on-dynamic-columns"/>
+    <w:bookmarkEnd w:id="29"/>
+    <w:bookmarkStart w:id="30" w:name="notes-on-dynamic-columns"/>
     <w:p>
       <w:pPr>
         <w:pStyle w:val="Heading3"/>
@@ -4124,9 +4458,9 @@
         <w:t xml:space="preserve">Status: Scoped — awaiting go-ahead to build</w:t>
       </w:r>
     </w:p>
-    <w:bookmarkEnd w:id="29"/>
     <w:bookmarkEnd w:id="30"/>
     <w:bookmarkEnd w:id="31"/>
+    <w:bookmarkEnd w:id="32"/>
     <w:sectPr>
       <w:footnotePr>
         <w:numRestart w:val="eachSect"/>

</xml_diff>